<commit_message>
feat: rebuild C1143 as 20-lab courseware
</commit_message>
<xml_diff>
--- a/courseware/C1143-Lesson-Plan.docx
+++ b/courseware/C1143-Lesson-Plan.docx
@@ -4,6 +4,7 @@
   <w:body>
     <w:p>
       <w:pPr>
+        <w:spacing w:before="2400"/>
         <w:jc w:val="center"/>
       </w:pPr>
       <w:r>
@@ -32,118 +33,27 @@
       <w:r>
         <w:rPr>
           <w:b/>
+          <w:sz w:val="36"/>
         </w:rPr>
         <w:t>Lesson Plan</w:t>
-        <w:br/>
+      </w:r>
+    </w:p>
+    <w:p>
+      <w:pPr>
+        <w:jc w:val="center"/>
+      </w:pPr>
+      <w:r>
         <w:t>Course Code: C1143</w:t>
         <w:br/>
-        <w:t>Version 1.0</w:t>
+        <w:t>Version 2.0</w:t>
+        <w:br/>
+        <w:t>15 hours / 2 days · Intermediate</w:t>
+        <w:br/>
+        <w:t>Conducted by Tertiary Infotech Academy Pte Ltd</w:t>
+        <w:br/>
+        <w:t>UEN: 201200696W</w:t>
       </w:r>
     </w:p>
-    <w:p/>
-    <w:tbl>
-      <w:tblPr>
-        <w:tblStyle w:val="TableGrid"/>
-        <w:tblW w:type="auto" w:w="0"/>
-        <w:tblLook w:firstColumn="1" w:firstRow="1" w:lastColumn="0" w:lastRow="0" w:noHBand="0" w:noVBand="1" w:val="04A0"/>
-      </w:tblPr>
-      <w:tblGrid>
-        <w:gridCol w:w="4968"/>
-        <w:gridCol w:w="4968"/>
-      </w:tblGrid>
-      <w:tr>
-        <w:tc>
-          <w:tcPr>
-            <w:tcW w:type="dxa" w:w="4968"/>
-            <w:shd w:fill="DDEBF7"/>
-          </w:tcPr>
-          <w:p>
-            <w:r>
-              <w:t>Duration</w:t>
-            </w:r>
-          </w:p>
-        </w:tc>
-        <w:tc>
-          <w:tcPr>
-            <w:tcW w:type="dxa" w:w="4968"/>
-          </w:tcPr>
-          <w:p>
-            <w:r>
-              <w:t>15 hours / 2 days</w:t>
-            </w:r>
-          </w:p>
-        </w:tc>
-      </w:tr>
-      <w:tr>
-        <w:tc>
-          <w:tcPr>
-            <w:tcW w:type="dxa" w:w="4968"/>
-            <w:shd w:fill="DDEBF7"/>
-          </w:tcPr>
-          <w:p>
-            <w:r>
-              <w:t>Level</w:t>
-            </w:r>
-          </w:p>
-        </w:tc>
-        <w:tc>
-          <w:tcPr>
-            <w:tcW w:type="dxa" w:w="4968"/>
-          </w:tcPr>
-          <w:p>
-            <w:r>
-              <w:t>Intermediate</w:t>
-            </w:r>
-          </w:p>
-        </w:tc>
-      </w:tr>
-      <w:tr>
-        <w:tc>
-          <w:tcPr>
-            <w:tcW w:type="dxa" w:w="4968"/>
-            <w:shd w:fill="DDEBF7"/>
-          </w:tcPr>
-          <w:p>
-            <w:r>
-              <w:t>Delivery</w:t>
-            </w:r>
-          </w:p>
-        </w:tc>
-        <w:tc>
-          <w:tcPr>
-            <w:tcW w:type="dxa" w:w="4968"/>
-          </w:tcPr>
-          <w:p>
-            <w:r>
-              <w:t>Instructor-led with guided hands-on practice</w:t>
-            </w:r>
-          </w:p>
-        </w:tc>
-      </w:tr>
-      <w:tr>
-        <w:tc>
-          <w:tcPr>
-            <w:tcW w:type="dxa" w:w="4968"/>
-            <w:shd w:fill="DDEBF7"/>
-          </w:tcPr>
-          <w:p>
-            <w:r>
-              <w:t>Source alignment</w:t>
-            </w:r>
-          </w:p>
-        </w:tc>
-        <w:tc>
-          <w:tcPr>
-            <w:tcW w:type="dxa" w:w="4968"/>
-          </w:tcPr>
-          <w:p>
-            <w:r>
-              <w:t>Published C1143 React topic sequence</w:t>
-            </w:r>
-          </w:p>
-        </w:tc>
-      </w:tr>
-    </w:tbl>
     <w:p>
       <w:r>
         <w:br w:type="page"/>
@@ -161,23 +71,26 @@
       <w:tblPr>
         <w:tblStyle w:val="TableGrid"/>
         <w:tblW w:type="auto" w:w="0"/>
+        <w:jc w:val="center"/>
         <w:tblLook w:firstColumn="1" w:firstRow="1" w:lastColumn="0" w:lastRow="0" w:noHBand="0" w:noVBand="1" w:val="04A0"/>
       </w:tblPr>
       <w:tblGrid>
-        <w:gridCol w:w="2484"/>
-        <w:gridCol w:w="2484"/>
-        <w:gridCol w:w="2484"/>
-        <w:gridCol w:w="2484"/>
+        <w:gridCol w:w="2541"/>
+        <w:gridCol w:w="2541"/>
+        <w:gridCol w:w="2541"/>
+        <w:gridCol w:w="2541"/>
       </w:tblGrid>
       <w:tr>
         <w:tc>
           <w:tcPr>
-            <w:tcW w:type="dxa" w:w="2484"/>
+            <w:tcW w:type="dxa" w:w="2541"/>
+            <w:vAlign w:val="center"/>
             <w:shd w:fill="0B6E99"/>
           </w:tcPr>
           <w:p>
             <w:r>
               <w:rPr>
+                <w:b/>
                 <w:color w:val="FFFFFF"/>
               </w:rPr>
               <w:t>Version</w:t>
@@ -186,43 +99,49 @@
         </w:tc>
         <w:tc>
           <w:tcPr>
-            <w:tcW w:type="dxa" w:w="2484"/>
+            <w:tcW w:type="dxa" w:w="2541"/>
+            <w:vAlign w:val="center"/>
             <w:shd w:fill="0B6E99"/>
           </w:tcPr>
           <w:p>
             <w:r>
               <w:rPr>
+                <w:b/>
                 <w:color w:val="FFFFFF"/>
               </w:rPr>
-              <w:t>Date</w:t>
+              <w:t>Effective date</w:t>
             </w:r>
           </w:p>
         </w:tc>
         <w:tc>
           <w:tcPr>
-            <w:tcW w:type="dxa" w:w="2484"/>
+            <w:tcW w:type="dxa" w:w="2541"/>
+            <w:vAlign w:val="center"/>
             <w:shd w:fill="0B6E99"/>
           </w:tcPr>
           <w:p>
             <w:r>
               <w:rPr>
+                <w:b/>
                 <w:color w:val="FFFFFF"/>
               </w:rPr>
-              <w:t>Author</w:t>
+              <w:t>Summary</w:t>
             </w:r>
           </w:p>
         </w:tc>
         <w:tc>
           <w:tcPr>
-            <w:tcW w:type="dxa" w:w="2484"/>
+            <w:tcW w:type="dxa" w:w="2541"/>
+            <w:vAlign w:val="center"/>
             <w:shd w:fill="0B6E99"/>
           </w:tcPr>
           <w:p>
             <w:r>
               <w:rPr>
+                <w:b/>
                 <w:color w:val="FFFFFF"/>
               </w:rPr>
-              <w:t>Change</w:t>
+              <w:t>Author</w:t>
             </w:r>
           </w:p>
         </w:tc>
@@ -230,41 +149,45 @@
       <w:tr>
         <w:tc>
           <w:tcPr>
-            <w:tcW w:type="dxa" w:w="2484"/>
+            <w:tcW w:type="dxa" w:w="2541"/>
+            <w:vAlign w:val="center"/>
           </w:tcPr>
           <w:p>
             <w:r>
-              <w:t>1.0</w:t>
+              <w:t>2.0</w:t>
             </w:r>
           </w:p>
         </w:tc>
         <w:tc>
           <w:tcPr>
-            <w:tcW w:type="dxa" w:w="2484"/>
+            <w:tcW w:type="dxa" w:w="2541"/>
+            <w:vAlign w:val="center"/>
           </w:tcPr>
           <w:p>
             <w:r>
-              <w:t>11 July 2026</w:t>
+              <w:t>2026-07-11</w:t>
             </w:r>
           </w:p>
         </w:tc>
         <w:tc>
           <w:tcPr>
-            <w:tcW w:type="dxa" w:w="2484"/>
+            <w:tcW w:type="dxa" w:w="2541"/>
+            <w:vAlign w:val="center"/>
           </w:tcPr>
           <w:p>
             <w:r>
-              <w:t>Tertiary Infotech Academy</w:t>
+              <w:t>Complete 20-lab agentic-loop rebuild</w:t>
             </w:r>
           </w:p>
         </w:tc>
         <w:tc>
           <w:tcPr>
-            <w:tcW w:type="dxa" w:w="2484"/>
+            <w:tcW w:type="dxa" w:w="2541"/>
+            <w:vAlign w:val="center"/>
           </w:tcPr>
           <w:p>
             <w:r>
-              <w:t>Initial non-WSQ release</w:t>
+              <w:t>Tertiary Infotech Academy</w:t>
             </w:r>
           </w:p>
         </w:tc>
@@ -280,7 +203,15 @@
     </w:p>
     <w:p>
       <w:r>
-        <w:t>Update this automatic table in Microsoft Word: References → Update Table.</w:t>
+        <w:fldChar w:fldCharType="begin"/>
+        <w:instrText xml:space="preserve">TOC \o "1-3" \h \z \u</w:instrText>
+        <w:fldChar w:fldCharType="separate"/>
+        <w:fldChar w:fldCharType="end"/>
+      </w:r>
+    </w:p>
+    <w:p>
+      <w:r>
+        <w:br w:type="page"/>
       </w:r>
     </w:p>
     <w:p>
@@ -288,12 +219,12 @@
         <w:pStyle w:val="Heading1"/>
       </w:pPr>
       <w:r>
-        <w:t>Facilitation Intent</w:t>
+        <w:t>Course Intent</w:t>
       </w:r>
     </w:p>
     <w:p>
       <w:r>
-        <w:t>Guide learners from a blank Vite project to a tested, deployed React single-page application while modelling safe, reviewable AI collaboration. Progress is checked through demonstrations, questions, and lab evidence.</w:t>
+        <w:t>Facilitate an intensive two-day adult-learning journey from an empty folder to a tested, deployed React capstone. Demonstrations are brief; guided practice, prediction, code reading, evidence and reflection dominate contact time.</w:t>
       </w:r>
     </w:p>
     <w:p>
@@ -301,7 +232,55 @@
         <w:pStyle w:val="Heading1"/>
       </w:pPr>
       <w:r>
-        <w:t>Session Plan — 900 instructional minutes</w:t>
+        <w:t>Learning Outcomes</w:t>
+      </w:r>
+    </w:p>
+    <w:p>
+      <w:pPr>
+        <w:pStyle w:val="ListBullet"/>
+      </w:pPr>
+      <w:r>
+        <w:t>Control AI coding work through an explicit engineering loop.</w:t>
+      </w:r>
+    </w:p>
+    <w:p>
+      <w:pPr>
+        <w:pStyle w:val="ListBullet"/>
+      </w:pPr>
+      <w:r>
+        <w:t>Explain and apply essential React concepts in a connected app.</w:t>
+      </w:r>
+    </w:p>
+    <w:p>
+      <w:pPr>
+        <w:pStyle w:val="ListBullet"/>
+      </w:pPr>
+      <w:r>
+        <w:t>Review generated code for correctness, accessibility, security and maintainability.</w:t>
+      </w:r>
+    </w:p>
+    <w:p>
+      <w:pPr>
+        <w:pStyle w:val="ListBullet"/>
+      </w:pPr>
+      <w:r>
+        <w:t>Test, debug and deploy a verified React production build.</w:t>
+      </w:r>
+    </w:p>
+    <w:p>
+      <w:pPr>
+        <w:pStyle w:val="Heading1"/>
+      </w:pPr>
+      <w:r>
+        <w:t>Detailed Two-Day Schedule</w:t>
+      </w:r>
+    </w:p>
+    <w:p>
+      <w:pPr>
+        <w:pStyle w:val="Heading2"/>
+      </w:pPr>
+      <w:r>
+        <w:t>Day 1</w:t>
       </w:r>
     </w:p>
     <w:tbl>
@@ -311,50 +290,41 @@
         <w:tblLook w:firstColumn="1" w:firstRow="1" w:lastColumn="0" w:lastRow="0" w:noHBand="0" w:noVBand="1" w:val="04A0"/>
       </w:tblPr>
       <w:tblGrid>
-        <w:gridCol w:w="3312"/>
-        <w:gridCol w:w="3312"/>
-        <w:gridCol w:w="3312"/>
+        <w:gridCol w:w="3389"/>
+        <w:gridCol w:w="3389"/>
+        <w:gridCol w:w="3389"/>
       </w:tblGrid>
       <w:tr>
         <w:tc>
           <w:tcPr>
-            <w:tcW w:type="dxa" w:w="3312"/>
+            <w:tcW w:type="dxa" w:w="3389"/>
             <w:shd w:fill="0B6E99"/>
           </w:tcPr>
           <w:p>
             <w:r>
-              <w:rPr>
-                <w:color w:val="FFFFFF"/>
-              </w:rPr>
-              <w:t>Segment</w:t>
+              <w:t>Time</w:t>
             </w:r>
           </w:p>
         </w:tc>
         <w:tc>
           <w:tcPr>
-            <w:tcW w:type="dxa" w:w="3312"/>
+            <w:tcW w:type="dxa" w:w="3389"/>
             <w:shd w:fill="0B6E99"/>
           </w:tcPr>
           <w:p>
             <w:r>
-              <w:rPr>
-                <w:color w:val="FFFFFF"/>
-              </w:rPr>
-              <w:t>Minutes</w:t>
+              <w:t>Activity</w:t>
             </w:r>
           </w:p>
         </w:tc>
         <w:tc>
           <w:tcPr>
-            <w:tcW w:type="dxa" w:w="3312"/>
+            <w:tcW w:type="dxa" w:w="3389"/>
             <w:shd w:fill="0B6E99"/>
           </w:tcPr>
           <w:p>
             <w:r>
-              <w:rPr>
-                <w:color w:val="FFFFFF"/>
-              </w:rPr>
-              <w:t>Observable outcome</w:t>
+              <w:t>Minutes</w:t>
             </w:r>
           </w:p>
         </w:tc>
@@ -362,31 +332,31 @@
       <w:tr>
         <w:tc>
           <w:tcPr>
-            <w:tcW w:type="dxa" w:w="3312"/>
+            <w:tcW w:type="dxa" w:w="3389"/>
           </w:tcPr>
           <w:p>
             <w:r>
-              <w:t>Day 1: welcome, setup and review loop</w:t>
+              <w:t>09:30–10:00</w:t>
             </w:r>
           </w:p>
         </w:tc>
         <w:tc>
           <w:tcPr>
-            <w:tcW w:type="dxa" w:w="3312"/>
+            <w:tcW w:type="dxa" w:w="3389"/>
           </w:tcPr>
           <w:p>
             <w:r>
-              <w:t>45</w:t>
+              <w:t>Welcome, readiness and agentic loop</w:t>
             </w:r>
           </w:p>
         </w:tc>
         <w:tc>
           <w:tcPr>
-            <w:tcW w:type="dxa" w:w="3312"/>
+            <w:tcW w:type="dxa" w:w="3389"/>
           </w:tcPr>
           <w:p>
             <w:r>
-              <w:t>Readiness check; define plan–diff–verify workflow</w:t>
+              <w:t>30</w:t>
             </w:r>
           </w:p>
         </w:tc>
@@ -394,31 +364,31 @@
       <w:tr>
         <w:tc>
           <w:tcPr>
-            <w:tcW w:type="dxa" w:w="3312"/>
+            <w:tcW w:type="dxa" w:w="3389"/>
           </w:tcPr>
           <w:p>
             <w:r>
-              <w:t>Topic 1 + Lab 1</w:t>
+              <w:t>10:00–11:20</w:t>
             </w:r>
           </w:p>
         </w:tc>
         <w:tc>
           <w:tcPr>
-            <w:tcW w:type="dxa" w:w="3312"/>
+            <w:tcW w:type="dxa" w:w="3389"/>
           </w:tcPr>
           <w:p>
             <w:r>
-              <w:t>180</w:t>
+              <w:t>Labs 1.1–1.2: workspace and scaffold</w:t>
             </w:r>
           </w:p>
         </w:tc>
         <w:tc>
           <w:tcPr>
-            <w:tcW w:type="dxa" w:w="3312"/>
+            <w:tcW w:type="dxa" w:w="3389"/>
           </w:tcPr>
           <w:p>
             <w:r>
-              <w:t>Vite baseline and AI coding contract</w:t>
+              <w:t>80</w:t>
             </w:r>
           </w:p>
         </w:tc>
@@ -426,31 +396,31 @@
       <w:tr>
         <w:tc>
           <w:tcPr>
-            <w:tcW w:type="dxa" w:w="3312"/>
+            <w:tcW w:type="dxa" w:w="3389"/>
           </w:tcPr>
           <w:p>
             <w:r>
-              <w:t>Topic 2 + Lab 2</w:t>
+              <w:t>11:20–11:30</w:t>
             </w:r>
           </w:p>
         </w:tc>
         <w:tc>
           <w:tcPr>
-            <w:tcW w:type="dxa" w:w="3312"/>
+            <w:tcW w:type="dxa" w:w="3389"/>
           </w:tcPr>
           <w:p>
             <w:r>
-              <w:t>210</w:t>
+              <w:t>Break</w:t>
             </w:r>
           </w:p>
         </w:tc>
         <w:tc>
           <w:tcPr>
-            <w:tcW w:type="dxa" w:w="3312"/>
+            <w:tcW w:type="dxa" w:w="3389"/>
           </w:tcPr>
           <w:p>
             <w:r>
-              <w:t>JSX, components, props, events and responsive UI</w:t>
+              <w:t>10</w:t>
             </w:r>
           </w:p>
         </w:tc>
@@ -458,31 +428,31 @@
       <w:tr>
         <w:tc>
           <w:tcPr>
-            <w:tcW w:type="dxa" w:w="3312"/>
+            <w:tcW w:type="dxa" w:w="3389"/>
           </w:tcPr>
           <w:p>
             <w:r>
-              <w:t>Day 1 consolidation</w:t>
+              <w:t>11:30–13:00</w:t>
             </w:r>
           </w:p>
         </w:tc>
         <w:tc>
           <w:tcPr>
-            <w:tcW w:type="dxa" w:w="3312"/>
+            <w:tcW w:type="dxa" w:w="3389"/>
           </w:tcPr>
           <w:p>
             <w:r>
-              <w:t>15</w:t>
+              <w:t>Labs 1.3–1.5: brief, prompt contract, first screen</w:t>
             </w:r>
           </w:p>
         </w:tc>
         <w:tc>
           <w:tcPr>
-            <w:tcW w:type="dxa" w:w="3312"/>
+            <w:tcW w:type="dxa" w:w="3389"/>
           </w:tcPr>
           <w:p>
             <w:r>
-              <w:t>Demonstrate the reusable SprintBoard UI</w:t>
+              <w:t>90</w:t>
             </w:r>
           </w:p>
         </w:tc>
@@ -490,17 +460,27 @@
       <w:tr>
         <w:tc>
           <w:tcPr>
-            <w:tcW w:type="dxa" w:w="3312"/>
+            <w:tcW w:type="dxa" w:w="3389"/>
           </w:tcPr>
           <w:p>
             <w:r>
-              <w:t>Day 2: recap and restore checkpoint</w:t>
+              <w:t>13:00–13:30</w:t>
             </w:r>
           </w:p>
         </w:tc>
         <w:tc>
           <w:tcPr>
-            <w:tcW w:type="dxa" w:w="3312"/>
+            <w:tcW w:type="dxa" w:w="3389"/>
+          </w:tcPr>
+          <w:p>
+            <w:r>
+              <w:t>Lunch</w:t>
+            </w:r>
+          </w:p>
+        </w:tc>
+        <w:tc>
+          <w:tcPr>
+            <w:tcW w:type="dxa" w:w="3389"/>
           </w:tcPr>
           <w:p>
             <w:r>
@@ -508,13 +488,35 @@
             </w:r>
           </w:p>
         </w:tc>
+      </w:tr>
+      <w:tr>
         <w:tc>
           <w:tcPr>
-            <w:tcW w:type="dxa" w:w="3312"/>
+            <w:tcW w:type="dxa" w:w="3389"/>
           </w:tcPr>
           <w:p>
             <w:r>
-              <w:t>Re-establish a trusted starting state</w:t>
+              <w:t>13:30–15:00</w:t>
+            </w:r>
+          </w:p>
+        </w:tc>
+        <w:tc>
+          <w:tcPr>
+            <w:tcW w:type="dxa" w:w="3389"/>
+          </w:tcPr>
+          <w:p>
+            <w:r>
+              <w:t>Labs 2.1–2.2: data, keys, components and props</w:t>
+            </w:r>
+          </w:p>
+        </w:tc>
+        <w:tc>
+          <w:tcPr>
+            <w:tcW w:type="dxa" w:w="3389"/>
+          </w:tcPr>
+          <w:p>
+            <w:r>
+              <w:t>90</w:t>
             </w:r>
           </w:p>
         </w:tc>
@@ -522,31 +524,31 @@
       <w:tr>
         <w:tc>
           <w:tcPr>
-            <w:tcW w:type="dxa" w:w="3312"/>
+            <w:tcW w:type="dxa" w:w="3389"/>
           </w:tcPr>
           <w:p>
             <w:r>
-              <w:t>Topic 3 + Lab 3</w:t>
+              <w:t>15:00–15:10</w:t>
             </w:r>
           </w:p>
         </w:tc>
         <w:tc>
           <w:tcPr>
-            <w:tcW w:type="dxa" w:w="3312"/>
+            <w:tcW w:type="dxa" w:w="3389"/>
           </w:tcPr>
           <w:p>
             <w:r>
-              <w:t>240</w:t>
+              <w:t>Break</w:t>
             </w:r>
           </w:p>
         </w:tc>
         <w:tc>
           <w:tcPr>
-            <w:tcW w:type="dxa" w:w="3312"/>
+            <w:tcW w:type="dxa" w:w="3389"/>
           </w:tcPr>
           <w:p>
             <w:r>
-              <w:t>State, hooks, routing, API states and refactoring</w:t>
+              <w:t>10</w:t>
             </w:r>
           </w:p>
         </w:tc>
@@ -554,31 +556,31 @@
       <w:tr>
         <w:tc>
           <w:tcPr>
-            <w:tcW w:type="dxa" w:w="3312"/>
+            <w:tcW w:type="dxa" w:w="3389"/>
           </w:tcPr>
           <w:p>
             <w:r>
-              <w:t>Topic 4 + Lab 4</w:t>
+              <w:t>15:10–16:30</w:t>
             </w:r>
           </w:p>
         </w:tc>
         <w:tc>
           <w:tcPr>
-            <w:tcW w:type="dxa" w:w="3312"/>
+            <w:tcW w:type="dxa" w:w="3389"/>
           </w:tcPr>
           <w:p>
             <w:r>
-              <w:t>165</w:t>
+              <w:t>Labs 2.3–2.4: composition, events and forms</w:t>
             </w:r>
           </w:p>
         </w:tc>
         <w:tc>
           <w:tcPr>
-            <w:tcW w:type="dxa" w:w="3312"/>
+            <w:tcW w:type="dxa" w:w="3389"/>
           </w:tcPr>
           <w:p>
             <w:r>
-              <w:t>Debugging, tests, optimization and deployment</w:t>
+              <w:t>80</w:t>
             </w:r>
           </w:p>
         </w:tc>
@@ -586,42 +588,71 @@
       <w:tr>
         <w:tc>
           <w:tcPr>
-            <w:tcW w:type="dxa" w:w="3312"/>
+            <w:tcW w:type="dxa" w:w="3389"/>
           </w:tcPr>
           <w:p>
             <w:r>
-              <w:t>Showcase and consolidation</w:t>
+              <w:t>16:30–17:20</w:t>
             </w:r>
           </w:p>
         </w:tc>
         <w:tc>
           <w:tcPr>
-            <w:tcW w:type="dxa" w:w="3312"/>
+            <w:tcW w:type="dxa" w:w="3389"/>
           </w:tcPr>
           <w:p>
             <w:r>
-              <w:t>15</w:t>
+              <w:t>Lab 2.5: responsive accessible CSS</w:t>
             </w:r>
           </w:p>
         </w:tc>
         <w:tc>
           <w:tcPr>
-            <w:tcW w:type="dxa" w:w="3312"/>
+            <w:tcW w:type="dxa" w:w="3389"/>
           </w:tcPr>
           <w:p>
             <w:r>
-              <w:t>Demonstrate deployed app and evidence trail</w:t>
+              <w:t>50</w:t>
+            </w:r>
+          </w:p>
+        </w:tc>
+      </w:tr>
+      <w:tr>
+        <w:tc>
+          <w:tcPr>
+            <w:tcW w:type="dxa" w:w="3389"/>
+          </w:tcPr>
+          <w:p>
+            <w:r>
+              <w:t>17:20–17:30</w:t>
+            </w:r>
+          </w:p>
+        </w:tc>
+        <w:tc>
+          <w:tcPr>
+            <w:tcW w:type="dxa" w:w="3389"/>
+          </w:tcPr>
+          <w:p>
+            <w:r>
+              <w:t>Checkpoint and reflection</w:t>
+            </w:r>
+          </w:p>
+        </w:tc>
+        <w:tc>
+          <w:tcPr>
+            <w:tcW w:type="dxa" w:w="3389"/>
+          </w:tcPr>
+          <w:p>
+            <w:r>
+              <w:t>10</w:t>
             </w:r>
           </w:p>
         </w:tc>
       </w:tr>
     </w:tbl>
     <w:p>
-      <w:pPr>
-        <w:pStyle w:val="Heading1"/>
-      </w:pPr>
       <w:r>
-        <w:t>Facilitator Notes by Topic</w:t>
+        <w:t>Instructional/contact minutes excluding lunch: 450.</w:t>
       </w:r>
     </w:p>
     <w:p>
@@ -629,17 +660,387 @@
         <w:pStyle w:val="Heading2"/>
       </w:pPr>
       <w:r>
-        <w:t>Topic 1 — Getting Started with AI Vibe Coding for React</w:t>
+        <w:t>Day 2</w:t>
+      </w:r>
+    </w:p>
+    <w:tbl>
+      <w:tblPr>
+        <w:tblStyle w:val="TableGrid"/>
+        <w:tblW w:type="auto" w:w="0"/>
+        <w:tblLook w:firstColumn="1" w:firstRow="1" w:lastColumn="0" w:lastRow="0" w:noHBand="0" w:noVBand="1" w:val="04A0"/>
+      </w:tblPr>
+      <w:tblGrid>
+        <w:gridCol w:w="3389"/>
+        <w:gridCol w:w="3389"/>
+        <w:gridCol w:w="3389"/>
+      </w:tblGrid>
+      <w:tr>
+        <w:tc>
+          <w:tcPr>
+            <w:tcW w:type="dxa" w:w="3389"/>
+            <w:shd w:fill="0B6E99"/>
+          </w:tcPr>
+          <w:p>
+            <w:r>
+              <w:t>Time</w:t>
+            </w:r>
+          </w:p>
+        </w:tc>
+        <w:tc>
+          <w:tcPr>
+            <w:tcW w:type="dxa" w:w="3389"/>
+            <w:shd w:fill="0B6E99"/>
+          </w:tcPr>
+          <w:p>
+            <w:r>
+              <w:t>Activity</w:t>
+            </w:r>
+          </w:p>
+        </w:tc>
+        <w:tc>
+          <w:tcPr>
+            <w:tcW w:type="dxa" w:w="3389"/>
+            <w:shd w:fill="0B6E99"/>
+          </w:tcPr>
+          <w:p>
+            <w:r>
+              <w:t>Minutes</w:t>
+            </w:r>
+          </w:p>
+        </w:tc>
+      </w:tr>
+      <w:tr>
+        <w:tc>
+          <w:tcPr>
+            <w:tcW w:type="dxa" w:w="3389"/>
+          </w:tcPr>
+          <w:p>
+            <w:r>
+              <w:t>09:30–09:50</w:t>
+            </w:r>
+          </w:p>
+        </w:tc>
+        <w:tc>
+          <w:tcPr>
+            <w:tcW w:type="dxa" w:w="3389"/>
+          </w:tcPr>
+          <w:p>
+            <w:r>
+              <w:t>Restore checkpoint and retrieval practice</w:t>
+            </w:r>
+          </w:p>
+        </w:tc>
+        <w:tc>
+          <w:tcPr>
+            <w:tcW w:type="dxa" w:w="3389"/>
+          </w:tcPr>
+          <w:p>
+            <w:r>
+              <w:t>20</w:t>
+            </w:r>
+          </w:p>
+        </w:tc>
+      </w:tr>
+      <w:tr>
+        <w:tc>
+          <w:tcPr>
+            <w:tcW w:type="dxa" w:w="3389"/>
+          </w:tcPr>
+          <w:p>
+            <w:r>
+              <w:t>09:50–11:20</w:t>
+            </w:r>
+          </w:p>
+        </w:tc>
+        <w:tc>
+          <w:tcPr>
+            <w:tcW w:type="dxa" w:w="3389"/>
+          </w:tcPr>
+          <w:p>
+            <w:r>
+              <w:t>Labs 3.1–3.2: state and effects</w:t>
+            </w:r>
+          </w:p>
+        </w:tc>
+        <w:tc>
+          <w:tcPr>
+            <w:tcW w:type="dxa" w:w="3389"/>
+          </w:tcPr>
+          <w:p>
+            <w:r>
+              <w:t>90</w:t>
+            </w:r>
+          </w:p>
+        </w:tc>
+      </w:tr>
+      <w:tr>
+        <w:tc>
+          <w:tcPr>
+            <w:tcW w:type="dxa" w:w="3389"/>
+          </w:tcPr>
+          <w:p>
+            <w:r>
+              <w:t>11:20–11:30</w:t>
+            </w:r>
+          </w:p>
+        </w:tc>
+        <w:tc>
+          <w:tcPr>
+            <w:tcW w:type="dxa" w:w="3389"/>
+          </w:tcPr>
+          <w:p>
+            <w:r>
+              <w:t>Break</w:t>
+            </w:r>
+          </w:p>
+        </w:tc>
+        <w:tc>
+          <w:tcPr>
+            <w:tcW w:type="dxa" w:w="3389"/>
+          </w:tcPr>
+          <w:p>
+            <w:r>
+              <w:t>10</w:t>
+            </w:r>
+          </w:p>
+        </w:tc>
+      </w:tr>
+      <w:tr>
+        <w:tc>
+          <w:tcPr>
+            <w:tcW w:type="dxa" w:w="3389"/>
+          </w:tcPr>
+          <w:p>
+            <w:r>
+              <w:t>11:30–13:00</w:t>
+            </w:r>
+          </w:p>
+        </w:tc>
+        <w:tc>
+          <w:tcPr>
+            <w:tcW w:type="dxa" w:w="3389"/>
+          </w:tcPr>
+          <w:p>
+            <w:r>
+              <w:t>Labs 3.3–3.5: hook, routing and fetch</w:t>
+            </w:r>
+          </w:p>
+        </w:tc>
+        <w:tc>
+          <w:tcPr>
+            <w:tcW w:type="dxa" w:w="3389"/>
+          </w:tcPr>
+          <w:p>
+            <w:r>
+              <w:t>90</w:t>
+            </w:r>
+          </w:p>
+        </w:tc>
+      </w:tr>
+      <w:tr>
+        <w:tc>
+          <w:tcPr>
+            <w:tcW w:type="dxa" w:w="3389"/>
+          </w:tcPr>
+          <w:p>
+            <w:r>
+              <w:t>13:00–13:30</w:t>
+            </w:r>
+          </w:p>
+        </w:tc>
+        <w:tc>
+          <w:tcPr>
+            <w:tcW w:type="dxa" w:w="3389"/>
+          </w:tcPr>
+          <w:p>
+            <w:r>
+              <w:t>Lunch</w:t>
+            </w:r>
+          </w:p>
+        </w:tc>
+        <w:tc>
+          <w:tcPr>
+            <w:tcW w:type="dxa" w:w="3389"/>
+          </w:tcPr>
+          <w:p>
+            <w:r>
+              <w:t>30</w:t>
+            </w:r>
+          </w:p>
+        </w:tc>
+      </w:tr>
+      <w:tr>
+        <w:tc>
+          <w:tcPr>
+            <w:tcW w:type="dxa" w:w="3389"/>
+          </w:tcPr>
+          <w:p>
+            <w:r>
+              <w:t>13:30–14:50</w:t>
+            </w:r>
+          </w:p>
+        </w:tc>
+        <w:tc>
+          <w:tcPr>
+            <w:tcW w:type="dxa" w:w="3389"/>
+          </w:tcPr>
+          <w:p>
+            <w:r>
+              <w:t>Labs 4.1–4.2: debugging and tests</w:t>
+            </w:r>
+          </w:p>
+        </w:tc>
+        <w:tc>
+          <w:tcPr>
+            <w:tcW w:type="dxa" w:w="3389"/>
+          </w:tcPr>
+          <w:p>
+            <w:r>
+              <w:t>80</w:t>
+            </w:r>
+          </w:p>
+        </w:tc>
+      </w:tr>
+      <w:tr>
+        <w:tc>
+          <w:tcPr>
+            <w:tcW w:type="dxa" w:w="3389"/>
+          </w:tcPr>
+          <w:p>
+            <w:r>
+              <w:t>14:50–15:00</w:t>
+            </w:r>
+          </w:p>
+        </w:tc>
+        <w:tc>
+          <w:tcPr>
+            <w:tcW w:type="dxa" w:w="3389"/>
+          </w:tcPr>
+          <w:p>
+            <w:r>
+              <w:t>Break</w:t>
+            </w:r>
+          </w:p>
+        </w:tc>
+        <w:tc>
+          <w:tcPr>
+            <w:tcW w:type="dxa" w:w="3389"/>
+          </w:tcPr>
+          <w:p>
+            <w:r>
+              <w:t>10</w:t>
+            </w:r>
+          </w:p>
+        </w:tc>
+      </w:tr>
+      <w:tr>
+        <w:tc>
+          <w:tcPr>
+            <w:tcW w:type="dxa" w:w="3389"/>
+          </w:tcPr>
+          <w:p>
+            <w:r>
+              <w:t>15:00–16:10</w:t>
+            </w:r>
+          </w:p>
+        </w:tc>
+        <w:tc>
+          <w:tcPr>
+            <w:tcW w:type="dxa" w:w="3389"/>
+          </w:tcPr>
+          <w:p>
+            <w:r>
+              <w:t>Labs 4.3–4.4: accessibility and performance</w:t>
+            </w:r>
+          </w:p>
+        </w:tc>
+        <w:tc>
+          <w:tcPr>
+            <w:tcW w:type="dxa" w:w="3389"/>
+          </w:tcPr>
+          <w:p>
+            <w:r>
+              <w:t>70</w:t>
+            </w:r>
+          </w:p>
+        </w:tc>
+      </w:tr>
+      <w:tr>
+        <w:tc>
+          <w:tcPr>
+            <w:tcW w:type="dxa" w:w="3389"/>
+          </w:tcPr>
+          <w:p>
+            <w:r>
+              <w:t>16:10–17:10</w:t>
+            </w:r>
+          </w:p>
+        </w:tc>
+        <w:tc>
+          <w:tcPr>
+            <w:tcW w:type="dxa" w:w="3389"/>
+          </w:tcPr>
+          <w:p>
+            <w:r>
+              <w:t>Lab 4.5: release and deployment</w:t>
+            </w:r>
+          </w:p>
+        </w:tc>
+        <w:tc>
+          <w:tcPr>
+            <w:tcW w:type="dxa" w:w="3389"/>
+          </w:tcPr>
+          <w:p>
+            <w:r>
+              <w:t>60</w:t>
+            </w:r>
+          </w:p>
+        </w:tc>
+      </w:tr>
+      <w:tr>
+        <w:tc>
+          <w:tcPr>
+            <w:tcW w:type="dxa" w:w="3389"/>
+          </w:tcPr>
+          <w:p>
+            <w:r>
+              <w:t>17:10–17:30</w:t>
+            </w:r>
+          </w:p>
+        </w:tc>
+        <w:tc>
+          <w:tcPr>
+            <w:tcW w:type="dxa" w:w="3389"/>
+          </w:tcPr>
+          <w:p>
+            <w:r>
+              <w:t>Demonstration, reflection and action plan</w:t>
+            </w:r>
+          </w:p>
+        </w:tc>
+        <w:tc>
+          <w:tcPr>
+            <w:tcW w:type="dxa" w:w="3389"/>
+          </w:tcPr>
+          <w:p>
+            <w:r>
+              <w:t>20</w:t>
+            </w:r>
+          </w:p>
+        </w:tc>
+      </w:tr>
+    </w:tbl>
+    <w:p>
+      <w:r>
+        <w:t>Instructional/contact minutes excluding lunch: 450.</w:t>
       </w:r>
     </w:p>
     <w:p>
+      <w:pPr>
+        <w:pStyle w:val="Heading1"/>
+      </w:pPr>
       <w:r>
-        <w:t>Set up an AI coding assistant, scaffold a Vite React app from a prompt, and establish a plan–diff–verify workflow.</w:t>
-      </w:r>
-    </w:p>
-    <w:p>
-      <w:r>
-        <w:t>Demonstration: show the Lab 1 checkpoint. Guided practice: learners execute in pairs, inspect the agent plan and compare diffs. Progress check: ask one learner to explain the verification evidence before accepting the change.</w:t>
+        <w:t>Facilitation Cycle for Every Lab</w:t>
       </w:r>
     </w:p>
     <w:p>
@@ -647,17 +1048,12 @@
         <w:pStyle w:val="Heading2"/>
       </w:pPr>
       <w:r>
-        <w:t>Topic 2 — Building React Components and UI with AI</w:t>
+        <w:t>Activate</w:t>
       </w:r>
     </w:p>
     <w:p>
       <w:r>
-        <w:t>Generate function components and JSX, compose reusable UI, pass data with props, handle events, and refine AI-generated CSS.</w:t>
-      </w:r>
-    </w:p>
-    <w:p>
-      <w:r>
-        <w:t>Demonstration: show the Lab 2 checkpoint. Guided practice: learners execute in pairs, inspect the agent plan and compare diffs. Progress check: ask one learner to explain the verification evidence before accepting the change.</w:t>
+        <w:t>Ask learners to retrieve the prior checkpoint and predict the next visible behavior.</w:t>
       </w:r>
     </w:p>
     <w:p>
@@ -665,17 +1061,12 @@
         <w:pStyle w:val="Heading2"/>
       </w:pPr>
       <w:r>
-        <w:t>Topic 3 — State, Hooks and Routing with AI Assistance</w:t>
+        <w:t>Model</w:t>
       </w:r>
     </w:p>
     <w:p>
       <w:r>
-        <w:t>Manage state and effects, add React Router, fetch API data, and refactor generated code without changing behavior.</w:t>
-      </w:r>
-    </w:p>
-    <w:p>
-      <w:r>
-        <w:t>Demonstration: show the Lab 3 checkpoint. Guided practice: learners execute in pairs, inspect the agent plan and compare diffs. Progress check: ask one learner to explain the verification evidence before accepting the change.</w:t>
+        <w:t>Demonstrate the first plan/diff decision aloud, including one rejected AI suggestion.</w:t>
       </w:r>
     </w:p>
     <w:p>
@@ -683,17 +1074,38 @@
         <w:pStyle w:val="Heading2"/>
       </w:pPr>
       <w:r>
-        <w:t>Topic 4 — Debugging, Testing and Deploying React Apps with AI</w:t>
+        <w:t>Guide</w:t>
       </w:r>
     </w:p>
     <w:p>
       <w:r>
-        <w:t>Diagnose failures, generate focused unit tests, optimize and document code, and deploy a verified production build.</w:t>
+        <w:t>Learners work in pairs: one drives, one audits scope and evidence; swap roles.</w:t>
+      </w:r>
+    </w:p>
+    <w:p>
+      <w:pPr>
+        <w:pStyle w:val="Heading2"/>
+      </w:pPr>
+      <w:r>
+        <w:t>Check</w:t>
       </w:r>
     </w:p>
     <w:p>
       <w:r>
-        <w:t>Demonstration: show the Lab 4 checkpoint. Guided practice: learners execute in pairs, inspect the agent plan and compare diffs. Progress check: ask one learner to explain the verification evidence before accepting the change.</w:t>
+        <w:t>Pause at verification gates and ask a learner to explain data or event flow.</w:t>
+      </w:r>
+    </w:p>
+    <w:p>
+      <w:pPr>
+        <w:pStyle w:val="Heading2"/>
+      </w:pPr>
+      <w:r>
+        <w:t>Release</w:t>
+      </w:r>
+    </w:p>
+    <w:p>
+      <w:r>
+        <w:t>Learners submit evidence, reflect and commit a recoverable checkpoint.</w:t>
       </w:r>
     </w:p>
     <w:p>
@@ -709,7 +1121,7 @@
         <w:pStyle w:val="ListBullet"/>
       </w:pPr>
       <w:r>
-        <w:t>Trainer reference project with checkpoint branches lab-1 through lab-4.</w:t>
+        <w:t>Trainer reference repository with one checkpoint per lab.</w:t>
       </w:r>
     </w:p>
     <w:p>
@@ -717,7 +1129,7 @@
         <w:pStyle w:val="ListBullet"/>
       </w:pPr>
       <w:r>
-        <w:t>Synthetic task data; no live services or credentials.</w:t>
+        <w:t>Prepared diffs and screenshots if an AI service is unavailable.</w:t>
       </w:r>
     </w:p>
     <w:p>
@@ -725,7 +1137,7 @@
         <w:pStyle w:val="ListBullet"/>
       </w:pPr>
       <w:r>
-        <w:t>If internet access fails, use the local JSON fixture and defer deployment while completing the production build.</w:t>
+        <w:t>Local synthetic JSON endpoint so API practice requires no credentials.</w:t>
       </w:r>
     </w:p>
     <w:p>
@@ -733,7 +1145,15 @@
         <w:pStyle w:val="ListBullet"/>
       </w:pPr>
       <w:r>
-        <w:t>If an AI service is unavailable, provide prepared plans and diffs for manual critique.</w:t>
+        <w:t>Git recovery sheet for learners who fall behind.</w:t>
+      </w:r>
+    </w:p>
+    <w:p>
+      <w:pPr>
+        <w:pStyle w:val="ListBullet"/>
+      </w:pPr>
+      <w:r>
+        <w:t>Browser accessibility tree and React DevTools for evidence-led inspection.</w:t>
       </w:r>
     </w:p>
     <w:p>
@@ -741,18 +1161,18 @@
         <w:pStyle w:val="Heading1"/>
       </w:pPr>
       <w:r>
-        <w:t>Closing Reflection</w:t>
+        <w:t>Formative Progress Checks</w:t>
       </w:r>
     </w:p>
     <w:p>
       <w:r>
-        <w:t>Each learner demonstrates one working behavior, identifies one risk in an AI suggestion, and states the command or device check used to verify the final code.</w:t>
+        <w:t>Use observation, questioning, demonstrations, diff explanations and lab evidence. These checks support learning and pacing; there is no formal assessment programme content in this package.</w:t>
       </w:r>
     </w:p>
     <w:sectPr>
       <w:footerReference w:type="default" r:id="rId9"/>
       <w:pgSz w:w="12240" w:h="15840"/>
-      <w:pgMar w:top="1080" w:right="1152" w:bottom="1008" w:left="1152" w:header="720" w:footer="720" w:gutter="0"/>
+      <w:pgMar w:top="936" w:right="1037" w:bottom="936" w:left="1037" w:header="720" w:footer="720" w:gutter="0"/>
       <w:cols w:space="720"/>
       <w:docGrid w:linePitch="360"/>
     </w:sectPr>
@@ -768,10 +1188,22 @@
       <w:jc w:val="center"/>
     </w:pPr>
     <w:r>
-      <w:rPr>
-        <w:sz w:val="16"/>
-      </w:rPr>
-      <w:t>Tertiary Infotech Academy Pte Ltd  |  C1143  |  Lesson Plan  |  v1.0</w:t>
+      <w:t xml:space="preserve">© 2026 Tertiary Infotech Academy Pte Ltd | C1143 | Lesson Plan | Page </w:t>
+    </w:r>
+    <w:r>
+      <w:fldChar w:fldCharType="begin"/>
+      <w:instrText xml:space="preserve">PAGE</w:instrText>
+      <w:fldChar w:fldCharType="separate"/>
+      <w:fldChar w:fldCharType="end"/>
+    </w:r>
+    <w:r>
+      <w:t xml:space="preserve"> of </w:t>
+    </w:r>
+    <w:r>
+      <w:fldChar w:fldCharType="begin"/>
+      <w:instrText xml:space="preserve">NUMPAGES</w:instrText>
+      <w:fldChar w:fldCharType="separate"/>
+      <w:fldChar w:fldCharType="end"/>
     </w:r>
   </w:p>
 </w:ftr>
@@ -1142,7 +1574,8 @@
     <w:rsid w:val="00FC693F"/>
     <w:rPr>
       <w:rFonts w:ascii="Arial" w:hAnsi="Arial"/>
-      <w:color w:val="222222"/>
+      <w:b w:val="0"/>
+      <w:color w:val="202A35"/>
       <w:sz w:val="21"/>
     </w:rPr>
   </w:style>
@@ -1209,7 +1642,7 @@
       <w:b/>
       <w:bCs/>
       <w:color w:val="0B6E99"/>
-      <w:sz w:val="36"/>
+      <w:sz w:val="38"/>
       <w:szCs w:val="28"/>
     </w:rPr>
   </w:style>
@@ -1233,7 +1666,7 @@
       <w:b/>
       <w:bCs/>
       <w:color w:val="17365D"/>
-      <w:sz w:val="28"/>
+      <w:sz w:val="30"/>
       <w:szCs w:val="26"/>
     </w:rPr>
   </w:style>
@@ -1256,8 +1689,8 @@
       <w:rFonts w:asciiTheme="majorHAnsi" w:eastAsiaTheme="majorEastAsia" w:hAnsiTheme="majorHAnsi" w:cstheme="majorBidi" w:ascii="Arial" w:hAnsi="Arial"/>
       <w:b/>
       <w:bCs/>
-      <w:color w:val="0B6E99"/>
-      <w:sz w:val="23"/>
+      <w:color w:val="14866D"/>
+      <w:sz w:val="24"/>
     </w:rPr>
   </w:style>
   <w:style w:type="paragraph" w:styleId="Heading4">
@@ -1496,6 +1929,7 @@
     </w:pPr>
     <w:rPr>
       <w:rFonts w:asciiTheme="majorHAnsi" w:eastAsiaTheme="majorEastAsia" w:hAnsiTheme="majorHAnsi" w:cstheme="majorBidi" w:ascii="Arial" w:hAnsi="Arial"/>
+      <w:b/>
       <w:color w:val="17365D"/>
       <w:spacing w:val="5"/>
       <w:kern w:val="28"/>
@@ -12828,6 +13262,14 @@
         <w:shd w:val="clear" w:color="auto" w:fill="FBCAA2" w:themeFill="accent6" w:themeFillTint="7F"/>
       </w:tcPr>
     </w:tblStylePr>
+  </w:style>
+  <w:style w:type="paragraph" w:customStyle="1" w:styleId="Code">
+    <w:name w:val="Code"/>
+    <w:rPr>
+      <w:rFonts w:ascii="Consolas" w:hAnsi="Consolas"/>
+      <w:color w:val="202A35"/>
+      <w:sz w:val="17"/>
+    </w:rPr>
   </w:style>
 </w:styles>
 </file>

</xml_diff>

<commit_message>
fix: v2.1 QA corrections — title, TOC, schedule traceability and content quality
- Correct course title to 'AI Vibe Coding for React Development' across deck, LG, LP, labs and README
- Fix step headings truncated at filename dots (labs, LG, deck sequence cards)
- Replace unresolved Word TOC fields with populated static tables of contents
- Rebalance lab minutes (770 total) so the Lesson Plan schedule traces exactly to 450 contact min/day
- Add real concept definitions, varied walkthrough guidance and per-symptom troubleshooting
- Point references at the published C1143 course page; add visual-enhanced deck + enhancer script
- Fix cover/closing slide subtitle overlap; bump version to 2.1

Co-Authored-By: Claude Fable 5 <noreply@anthropic.com>
</commit_message>
<xml_diff>
--- a/courseware/C1143-Lesson-Plan.docx
+++ b/courseware/C1143-Lesson-Plan.docx
@@ -23,7 +23,7 @@
         <w:jc w:val="center"/>
       </w:pPr>
       <w:r>
-        <w:t>React AI Vibe Coding for React Development</w:t>
+        <w:t>AI Vibe Coding for React Development</w:t>
       </w:r>
     </w:p>
     <w:p>
@@ -45,7 +45,7 @@
       <w:r>
         <w:t>Course Code: C1143</w:t>
         <w:br/>
-        <w:t>Version 2.0</w:t>
+        <w:t>Version 2.1</w:t>
         <w:br/>
         <w:t>15 hours / 2 days · Intermediate</w:t>
         <w:br/>
@@ -165,7 +165,7 @@
           </w:tcPr>
           <w:p>
             <w:r>
-              <w:t>2026-07-11</w:t>
+              <w:t>2026-07-12</w:t>
             </w:r>
           </w:p>
         </w:tc>
@@ -192,6 +192,52 @@
           </w:p>
         </w:tc>
       </w:tr>
+      <w:tr>
+        <w:tc>
+          <w:tcPr>
+            <w:tcW w:type="dxa" w:w="2541"/>
+            <w:vAlign w:val="center"/>
+          </w:tcPr>
+          <w:p>
+            <w:r>
+              <w:t>2.1</w:t>
+            </w:r>
+          </w:p>
+        </w:tc>
+        <w:tc>
+          <w:tcPr>
+            <w:tcW w:type="dxa" w:w="2541"/>
+            <w:vAlign w:val="center"/>
+          </w:tcPr>
+          <w:p>
+            <w:r>
+              <w:t>2026-07-21</w:t>
+            </w:r>
+          </w:p>
+        </w:tc>
+        <w:tc>
+          <w:tcPr>
+            <w:tcW w:type="dxa" w:w="2541"/>
+            <w:vAlign w:val="center"/>
+          </w:tcPr>
+          <w:p>
+            <w:r>
+              <w:t>Title, contents, schedule and content-quality corrections</w:t>
+            </w:r>
+          </w:p>
+        </w:tc>
+        <w:tc>
+          <w:tcPr>
+            <w:tcW w:type="dxa" w:w="2541"/>
+            <w:vAlign w:val="center"/>
+          </w:tcPr>
+          <w:p>
+            <w:r>
+              <w:t>Tertiary Infotech Academy</w:t>
+            </w:r>
+          </w:p>
+        </w:tc>
+      </w:tr>
     </w:tbl>
     <w:p>
       <w:pPr>
@@ -202,11 +248,107 @@
       </w:r>
     </w:p>
     <w:p>
+      <w:pPr>
+        <w:spacing w:after="40"/>
+        <w:ind w:left="0"/>
+      </w:pPr>
       <w:r>
-        <w:fldChar w:fldCharType="begin"/>
-        <w:instrText xml:space="preserve">TOC \o "1-3" \h \z \u</w:instrText>
-        <w:fldChar w:fldCharType="separate"/>
-        <w:fldChar w:fldCharType="end"/>
+        <w:rPr>
+          <w:b/>
+          <w:sz w:val="21"/>
+        </w:rPr>
+        <w:t>Course Intent</w:t>
+      </w:r>
+    </w:p>
+    <w:p>
+      <w:pPr>
+        <w:spacing w:after="40"/>
+        <w:ind w:left="0"/>
+      </w:pPr>
+      <w:r>
+        <w:rPr>
+          <w:b/>
+          <w:sz w:val="21"/>
+        </w:rPr>
+        <w:t>Learning Outcomes</w:t>
+      </w:r>
+    </w:p>
+    <w:p>
+      <w:pPr>
+        <w:spacing w:after="40"/>
+        <w:ind w:left="0"/>
+      </w:pPr>
+      <w:r>
+        <w:rPr>
+          <w:b/>
+          <w:sz w:val="21"/>
+        </w:rPr>
+        <w:t>Detailed Two-Day Schedule</w:t>
+      </w:r>
+    </w:p>
+    <w:p>
+      <w:pPr>
+        <w:spacing w:after="40"/>
+        <w:ind w:left="432"/>
+      </w:pPr>
+      <w:r>
+        <w:rPr>
+          <w:b w:val="0"/>
+          <w:sz w:val="19"/>
+        </w:rPr>
+        <w:t>Day 1</w:t>
+      </w:r>
+    </w:p>
+    <w:p>
+      <w:pPr>
+        <w:spacing w:after="40"/>
+        <w:ind w:left="432"/>
+      </w:pPr>
+      <w:r>
+        <w:rPr>
+          <w:b w:val="0"/>
+          <w:sz w:val="19"/>
+        </w:rPr>
+        <w:t>Day 2</w:t>
+      </w:r>
+    </w:p>
+    <w:p>
+      <w:pPr>
+        <w:spacing w:after="40"/>
+        <w:ind w:left="0"/>
+      </w:pPr>
+      <w:r>
+        <w:rPr>
+          <w:b/>
+          <w:sz w:val="21"/>
+        </w:rPr>
+        <w:t>Facilitation Cycle for Every Lab</w:t>
+      </w:r>
+    </w:p>
+    <w:p>
+      <w:pPr>
+        <w:spacing w:after="40"/>
+        <w:ind w:left="0"/>
+      </w:pPr>
+      <w:r>
+        <w:rPr>
+          <w:b/>
+          <w:sz w:val="21"/>
+        </w:rPr>
+        <w:t>Resources and Contingencies</w:t>
+      </w:r>
+    </w:p>
+    <w:p>
+      <w:pPr>
+        <w:spacing w:after="40"/>
+        <w:ind w:left="0"/>
+      </w:pPr>
+      <w:r>
+        <w:rPr>
+          <w:b/>
+          <w:sz w:val="21"/>
+        </w:rPr>
+        <w:t>Formative Progress Checks</w:t>
       </w:r>
     </w:p>
     <w:p>
@@ -346,7 +488,7 @@
           </w:tcPr>
           <w:p>
             <w:r>
-              <w:t>Welcome, readiness and agentic loop</w:t>
+              <w:t>Welcome, readiness and the agentic loop</w:t>
             </w:r>
           </w:p>
         </w:tc>
@@ -368,7 +510,7 @@
           </w:tcPr>
           <w:p>
             <w:r>
-              <w:t>10:00–11:20</w:t>
+              <w:t>10:00–11:15</w:t>
             </w:r>
           </w:p>
         </w:tc>
@@ -378,7 +520,7 @@
           </w:tcPr>
           <w:p>
             <w:r>
-              <w:t>Labs 1.1–1.2: workspace and scaffold</w:t>
+              <w:t>Labs 1.1–1.2: workspace (35) and scaffold (40)</w:t>
             </w:r>
           </w:p>
         </w:tc>
@@ -388,7 +530,7 @@
           </w:tcPr>
           <w:p>
             <w:r>
-              <w:t>80</w:t>
+              <w:t>75</w:t>
             </w:r>
           </w:p>
         </w:tc>
@@ -400,7 +542,7 @@
           </w:tcPr>
           <w:p>
             <w:r>
-              <w:t>11:20–11:30</w:t>
+              <w:t>11:15–11:25</w:t>
             </w:r>
           </w:p>
         </w:tc>
@@ -432,7 +574,7 @@
           </w:tcPr>
           <w:p>
             <w:r>
-              <w:t>11:30–13:00</w:t>
+              <w:t>11:25–12:30</w:t>
             </w:r>
           </w:p>
         </w:tc>
@@ -442,7 +584,7 @@
           </w:tcPr>
           <w:p>
             <w:r>
-              <w:t>Labs 1.3–1.5: brief, prompt contract, first screen</w:t>
+              <w:t>Labs 1.3–1.4: product brief (30) and prompt contract (35)</w:t>
             </w:r>
           </w:p>
         </w:tc>
@@ -452,7 +594,7 @@
           </w:tcPr>
           <w:p>
             <w:r>
-              <w:t>90</w:t>
+              <w:t>65</w:t>
             </w:r>
           </w:p>
         </w:tc>
@@ -464,7 +606,39 @@
           </w:tcPr>
           <w:p>
             <w:r>
-              <w:t>13:00–13:30</w:t>
+              <w:t>12:30–13:10</w:t>
+            </w:r>
+          </w:p>
+        </w:tc>
+        <w:tc>
+          <w:tcPr>
+            <w:tcW w:type="dxa" w:w="3389"/>
+          </w:tcPr>
+          <w:p>
+            <w:r>
+              <w:t>Lab 1.5: first React screen (40)</w:t>
+            </w:r>
+          </w:p>
+        </w:tc>
+        <w:tc>
+          <w:tcPr>
+            <w:tcW w:type="dxa" w:w="3389"/>
+          </w:tcPr>
+          <w:p>
+            <w:r>
+              <w:t>40</w:t>
+            </w:r>
+          </w:p>
+        </w:tc>
+      </w:tr>
+      <w:tr>
+        <w:tc>
+          <w:tcPr>
+            <w:tcW w:type="dxa" w:w="3389"/>
+          </w:tcPr>
+          <w:p>
+            <w:r>
+              <w:t>13:10–13:40</w:t>
             </w:r>
           </w:p>
         </w:tc>
@@ -496,7 +670,7 @@
           </w:tcPr>
           <w:p>
             <w:r>
-              <w:t>13:30–15:00</w:t>
+              <w:t>13:40–15:00</w:t>
             </w:r>
           </w:p>
         </w:tc>
@@ -506,7 +680,7 @@
           </w:tcPr>
           <w:p>
             <w:r>
-              <w:t>Labs 2.1–2.2: data, keys, components and props</w:t>
+              <w:t>Labs 2.1–2.2: data and keys (40), components and props (40)</w:t>
             </w:r>
           </w:p>
         </w:tc>
@@ -516,7 +690,7 @@
           </w:tcPr>
           <w:p>
             <w:r>
-              <w:t>90</w:t>
+              <w:t>80</w:t>
             </w:r>
           </w:p>
         </w:tc>
@@ -570,7 +744,7 @@
           </w:tcPr>
           <w:p>
             <w:r>
-              <w:t>Labs 2.3–2.4: composition, events and forms</w:t>
+              <w:t>Labs 2.3–2.4: composition (35), events and forms (45)</w:t>
             </w:r>
           </w:p>
         </w:tc>
@@ -592,7 +766,7 @@
           </w:tcPr>
           <w:p>
             <w:r>
-              <w:t>16:30–17:20</w:t>
+              <w:t>16:30–17:10</w:t>
             </w:r>
           </w:p>
         </w:tc>
@@ -602,7 +776,7 @@
           </w:tcPr>
           <w:p>
             <w:r>
-              <w:t>Lab 2.5: responsive accessible CSS</w:t>
+              <w:t>Lab 2.5: responsive accessible CSS (40)</w:t>
             </w:r>
           </w:p>
         </w:tc>
@@ -612,7 +786,7 @@
           </w:tcPr>
           <w:p>
             <w:r>
-              <w:t>50</w:t>
+              <w:t>40</w:t>
             </w:r>
           </w:p>
         </w:tc>
@@ -624,7 +798,7 @@
           </w:tcPr>
           <w:p>
             <w:r>
-              <w:t>17:20–17:30</w:t>
+              <w:t>17:10–17:30</w:t>
             </w:r>
           </w:p>
         </w:tc>
@@ -644,7 +818,7 @@
           </w:tcPr>
           <w:p>
             <w:r>
-              <w:t>10</w:t>
+              <w:t>20</w:t>
             </w:r>
           </w:p>
         </w:tc>
@@ -748,7 +922,7 @@
           </w:tcPr>
           <w:p>
             <w:r>
-              <w:t>09:50–11:20</w:t>
+              <w:t>09:50–11:10</w:t>
             </w:r>
           </w:p>
         </w:tc>
@@ -758,7 +932,7 @@
           </w:tcPr>
           <w:p>
             <w:r>
-              <w:t>Labs 3.1–3.2: state and effects</w:t>
+              <w:t>Labs 3.1–3.2: state (40) and effects (40)</w:t>
             </w:r>
           </w:p>
         </w:tc>
@@ -768,7 +942,7 @@
           </w:tcPr>
           <w:p>
             <w:r>
-              <w:t>90</w:t>
+              <w:t>80</w:t>
             </w:r>
           </w:p>
         </w:tc>
@@ -780,7 +954,7 @@
           </w:tcPr>
           <w:p>
             <w:r>
-              <w:t>11:20–11:30</w:t>
+              <w:t>11:10–11:20</w:t>
             </w:r>
           </w:p>
         </w:tc>
@@ -812,7 +986,7 @@
           </w:tcPr>
           <w:p>
             <w:r>
-              <w:t>11:30–13:00</w:t>
+              <w:t>11:20–12:35</w:t>
             </w:r>
           </w:p>
         </w:tc>
@@ -822,7 +996,7 @@
           </w:tcPr>
           <w:p>
             <w:r>
-              <w:t>Labs 3.3–3.5: hook, routing and fetch</w:t>
+              <w:t>Labs 3.3–3.4: custom hook (35) and routing (40)</w:t>
             </w:r>
           </w:p>
         </w:tc>
@@ -832,7 +1006,7 @@
           </w:tcPr>
           <w:p>
             <w:r>
-              <w:t>90</w:t>
+              <w:t>75</w:t>
             </w:r>
           </w:p>
         </w:tc>
@@ -844,7 +1018,39 @@
           </w:tcPr>
           <w:p>
             <w:r>
-              <w:t>13:00–13:30</w:t>
+              <w:t>12:35–13:20</w:t>
+            </w:r>
+          </w:p>
+        </w:tc>
+        <w:tc>
+          <w:tcPr>
+            <w:tcW w:type="dxa" w:w="3389"/>
+          </w:tcPr>
+          <w:p>
+            <w:r>
+              <w:t>Lab 3.5: API data and resilient states (45)</w:t>
+            </w:r>
+          </w:p>
+        </w:tc>
+        <w:tc>
+          <w:tcPr>
+            <w:tcW w:type="dxa" w:w="3389"/>
+          </w:tcPr>
+          <w:p>
+            <w:r>
+              <w:t>45</w:t>
+            </w:r>
+          </w:p>
+        </w:tc>
+      </w:tr>
+      <w:tr>
+        <w:tc>
+          <w:tcPr>
+            <w:tcW w:type="dxa" w:w="3389"/>
+          </w:tcPr>
+          <w:p>
+            <w:r>
+              <w:t>13:20–13:50</w:t>
             </w:r>
           </w:p>
         </w:tc>
@@ -876,7 +1082,7 @@
           </w:tcPr>
           <w:p>
             <w:r>
-              <w:t>13:30–14:50</w:t>
+              <w:t>13:50–15:10</w:t>
             </w:r>
           </w:p>
         </w:tc>
@@ -886,7 +1092,7 @@
           </w:tcPr>
           <w:p>
             <w:r>
-              <w:t>Labs 4.1–4.2: debugging and tests</w:t>
+              <w:t>Labs 4.1–4.2: debugging (35) and testing (45)</w:t>
             </w:r>
           </w:p>
         </w:tc>
@@ -908,7 +1114,7 @@
           </w:tcPr>
           <w:p>
             <w:r>
-              <w:t>14:50–15:00</w:t>
+              <w:t>15:10–15:20</w:t>
             </w:r>
           </w:p>
         </w:tc>
@@ -940,7 +1146,7 @@
           </w:tcPr>
           <w:p>
             <w:r>
-              <w:t>15:00–16:10</w:t>
+              <w:t>15:20–16:30</w:t>
             </w:r>
           </w:p>
         </w:tc>
@@ -950,7 +1156,7 @@
           </w:tcPr>
           <w:p>
             <w:r>
-              <w:t>Labs 4.3–4.4: accessibility and performance</w:t>
+              <w:t>Labs 4.3–4.4: accessibility (35) and performance (35)</w:t>
             </w:r>
           </w:p>
         </w:tc>
@@ -972,7 +1178,7 @@
           </w:tcPr>
           <w:p>
             <w:r>
-              <w:t>16:10–17:10</w:t>
+              <w:t>16:30–17:10</w:t>
             </w:r>
           </w:p>
         </w:tc>
@@ -982,7 +1188,7 @@
           </w:tcPr>
           <w:p>
             <w:r>
-              <w:t>Lab 4.5: release and deployment</w:t>
+              <w:t>Lab 4.5: release and deployment (40)</w:t>
             </w:r>
           </w:p>
         </w:tc>
@@ -992,7 +1198,7 @@
           </w:tcPr>
           <w:p>
             <w:r>
-              <w:t>60</w:t>
+              <w:t>40</w:t>
             </w:r>
           </w:p>
         </w:tc>
@@ -1166,7 +1372,7 @@
     </w:p>
     <w:p>
       <w:r>
-        <w:t>Use observation, questioning, demonstrations, diff explanations and lab evidence. These checks support learning and pacing; there is no formal assessment programme content in this package.</w:t>
+        <w:t>Use observation, questioning, demonstrations, diff explanations and lab evidence. These checks support learning and pacing and are not graded.</w:t>
       </w:r>
     </w:p>
     <w:sectPr>

</xml_diff>